<commit_message>
Fortalece script HITL y evidencia entrega
</commit_message>
<xml_diff>
--- a/docs/memoria/entregas/segunda_entrega/Segunda_Entrega_TFM_Joseph_Gari_Borrador_Estructurado.docx
+++ b/docs/memoria/entregas/segunda_entrega/Segunda_Entrega_TFM_Joseph_Gari_Borrador_Estructurado.docx
@@ -5583,40 +5583,13 @@
       <w:bookmarkEnd w:id="25"/>
     </w:p>
     <w:p>
-      <w:r>
-        <w:t xml:space="preserve">Dado que este TFM corresponde a un trabajo Tipo 2: Desarrollo software, el </w:t>
-      </w:r>
-      <w:proofErr w:type="spellStart"/>
-      <w:r>
-        <w:t>capitulo</w:t>
-      </w:r>
-      <w:proofErr w:type="spellEnd"/>
-      <w:r>
-        <w:t xml:space="preserve"> se organiza en tres bloques: </w:t>
-      </w:r>
-      <w:proofErr w:type="spellStart"/>
-      <w:r>
-        <w:t>identificacion</w:t>
-      </w:r>
-      <w:proofErr w:type="spellEnd"/>
-      <w:r>
-        <w:t xml:space="preserve"> de requisitos, </w:t>
-      </w:r>
-      <w:proofErr w:type="spellStart"/>
-      <w:r>
-        <w:t>descripcion</w:t>
-      </w:r>
-      <w:proofErr w:type="spellEnd"/>
-      <w:r>
-        <w:t xml:space="preserve"> de la herramienta desarrollada y </w:t>
-      </w:r>
-      <w:proofErr w:type="spellStart"/>
-      <w:r>
-        <w:t>evaluacion</w:t>
-      </w:r>
-      <w:proofErr w:type="spellEnd"/>
-      <w:r>
-        <w:t xml:space="preserve"> inicial de usabilidad y aplicabilidad.</w:t>
+      <w:pPr/>
+      <w:r>
+        <w:rPr>
+          <w:b w:val="0"/>
+          <w:i w:val="0"/>
+        </w:rPr>
+        <w:t>Dado que este TFM corresponde a un trabajo Tipo 2: Desarrollo software, el capítulo se organiza en tres bloques: identificación de requisitos, descripción de la herramienta desarrollada y evaluación inicial de usabilidad y aplicabilidad. La evidencia incorporada en esta segunda entrega procede del prototipo AURA ejecutado en navegador con tres datasets sintéticos pequeños, diseñados para activar reglas de integridad, higiene textual, inferencia de tipos y lógica de negocio.</w:t>
       </w:r>
     </w:p>
     <w:p>
@@ -5624,102 +5597,31 @@
         <w:pStyle w:val="Heading2"/>
       </w:pPr>
       <w:r>
-        <w:t xml:space="preserve"> </w:t>
-      </w:r>
-      <w:r>
-        <w:t>Identificacion de requisitos</w:t>
-      </w:r>
-    </w:p>
-    <w:p>
-      <w:r>
-        <w:t xml:space="preserve">El problema que </w:t>
-      </w:r>
-      <w:r>
-        <w:t>guía</w:t>
-      </w:r>
-      <w:r>
-        <w:t xml:space="preserve"> el desarrollo de AURA es el data </w:t>
-      </w:r>
-      <w:proofErr w:type="spellStart"/>
-      <w:r>
-        <w:t>downtime</w:t>
-      </w:r>
-      <w:proofErr w:type="spellEnd"/>
-      <w:r>
-        <w:t xml:space="preserve"> producido por </w:t>
-      </w:r>
-      <w:proofErr w:type="spellStart"/>
-      <w:r>
-        <w:t>datasets</w:t>
-      </w:r>
-      <w:proofErr w:type="spellEnd"/>
-      <w:r>
-        <w:t xml:space="preserve"> con fallos estructurales, valores inconsistentes, tipos ambiguos, datos faltantes, duplicados y reglas de negocio incumplidas. En contextos de </w:t>
-      </w:r>
-      <w:r>
-        <w:t>analítica</w:t>
-      </w:r>
-      <w:r>
-        <w:t xml:space="preserve">, </w:t>
-      </w:r>
-      <w:proofErr w:type="spellStart"/>
-      <w:r>
-        <w:t>reporting</w:t>
-      </w:r>
-      <w:proofErr w:type="spellEnd"/>
-      <w:r>
-        <w:t xml:space="preserve">, </w:t>
-      </w:r>
-      <w:r>
-        <w:t>migración</w:t>
-      </w:r>
-      <w:r>
-        <w:t xml:space="preserve"> o entrenamiento de modelos, estos defectos pueden propagarse silenciosamente y generar decisiones poco confiables.</w:t>
-      </w:r>
-    </w:p>
-    <w:p>
-      <w:r>
-        <w:t xml:space="preserve">El contexto habitual de uso es la auditoria </w:t>
-      </w:r>
-      <w:r>
-        <w:t>técnica</w:t>
-      </w:r>
-      <w:r>
-        <w:t xml:space="preserve"> de </w:t>
-      </w:r>
-      <w:proofErr w:type="spellStart"/>
-      <w:r>
-        <w:t>datasets</w:t>
-      </w:r>
-      <w:proofErr w:type="spellEnd"/>
-      <w:r>
-        <w:t xml:space="preserve"> tabulares antes de su </w:t>
-      </w:r>
-      <w:r>
-        <w:t>explotación</w:t>
-      </w:r>
-      <w:r>
-        <w:t xml:space="preserve">. Los usuarios objetivo son analistas de datos, data </w:t>
-      </w:r>
-      <w:proofErr w:type="spellStart"/>
-      <w:r>
-        <w:t>engineers</w:t>
-      </w:r>
-      <w:proofErr w:type="spellEnd"/>
-      <w:r>
-        <w:t xml:space="preserve">, auditores </w:t>
-      </w:r>
-      <w:r>
-        <w:t>técnicos</w:t>
-      </w:r>
-      <w:r>
-        <w:t xml:space="preserve"> y equipos que necesitan comprender </w:t>
-      </w:r>
-      <w:r>
-        <w:t>rápidamente</w:t>
-      </w:r>
-      <w:r>
-        <w:t xml:space="preserve"> el estado de un CSV sin construir pipelines complejos.</w:t>
+        <w:rPr>
+          <w:b w:val="0"/>
+          <w:i w:val="0"/>
+        </w:rPr>
+        <w:t>Identificación de requisitos</w:t>
+      </w:r>
+    </w:p>
+    <w:p>
+      <w:pPr/>
+      <w:r>
+        <w:rPr>
+          <w:b w:val="0"/>
+          <w:i w:val="0"/>
+        </w:rPr>
+        <w:t>El problema que guía el desarrollo de AURA es el data downtime producido por datasets con fallos estructurales, valores inconsistentes, tipos ambiguos, duplicados, placeholders, errores de formato y reglas de negocio incumplidas. En contextos reales, estos problemas suelen detectarse tarde, cuando el dataset ya se encuentra conectado a procesos analíticos, modelos predictivos o reportes de decisión.</w:t>
+      </w:r>
+    </w:p>
+    <w:p>
+      <w:pPr/>
+      <w:r>
+        <w:rPr>
+          <w:b w:val="0"/>
+          <w:i w:val="0"/>
+        </w:rPr>
+        <w:t>El contexto habitual de uso es la auditoría técnica de datasets tabulares antes de su explotación. Los usuarios objetivo son analistas de datos, data engineers, auditores técnicos y equipos que necesitan comprender rápidamente la salud estructural de un archivo CSV sin exponer el dataset crudo a servicios externos.</w:t>
       </w:r>
     </w:p>
     <w:p>
@@ -5727,52 +5629,81 @@
         <w:pStyle w:val="Heading3"/>
       </w:pPr>
       <w:r>
+        <w:rPr>
+          <w:b w:val="0"/>
+          <w:i w:val="0"/>
+        </w:rPr>
         <w:t>Requisitos funcionales</w:t>
       </w:r>
     </w:p>
     <w:p>
-      <w:r>
-        <w:t xml:space="preserve">AURA debe permitir cargar CSV, perfilar </w:t>
-      </w:r>
-      <w:proofErr w:type="spellStart"/>
-      <w:r>
-        <w:t>datasets</w:t>
-      </w:r>
-      <w:proofErr w:type="spellEnd"/>
-      <w:r>
-        <w:t xml:space="preserve">, ejecutar reglas deterministas, presentar hallazgos reproducibles, construir un paquete estructurado de evidencia, diagnosticar con LLM local o </w:t>
-      </w:r>
-      <w:proofErr w:type="spellStart"/>
-      <w:r>
-        <w:t>cloud</w:t>
-      </w:r>
-      <w:proofErr w:type="spellEnd"/>
-      <w:r>
-        <w:t xml:space="preserve">, generar scripts Python/Pandas, validar dichos scripts, habilitar </w:t>
-      </w:r>
-      <w:proofErr w:type="spellStart"/>
-      <w:r>
-        <w:t>revision</w:t>
-      </w:r>
-      <w:proofErr w:type="spellEnd"/>
-      <w:r>
-        <w:t xml:space="preserve"> humana, simular una mejora y exportar evidencia </w:t>
-      </w:r>
-      <w:proofErr w:type="spellStart"/>
-      <w:r>
-        <w:t>tecnica</w:t>
-      </w:r>
-      <w:proofErr w:type="spellEnd"/>
-      <w:r>
-        <w:t xml:space="preserve">. </w:t>
-      </w:r>
-      <w:proofErr w:type="spellStart"/>
-      <w:r>
-        <w:t>Tambien</w:t>
-      </w:r>
-      <w:proofErr w:type="spellEnd"/>
-      <w:r>
-        <w:t xml:space="preserve"> debe permitir comparar modelos LLM bajo una misma entrada experimental.</w:t>
+      <w:pPr/>
+      <w:r>
+        <w:rPr>
+          <w:b w:val="0"/>
+          <w:i w:val="0"/>
+        </w:rPr>
+        <w:t>• Cargar archivos CSV localmente desde el navegador y registrar metadatos básicos de ejecución.</w:t>
+      </w:r>
+    </w:p>
+    <w:p>
+      <w:pPr/>
+      <w:r>
+        <w:rPr>
+          <w:b w:val="0"/>
+          <w:i w:val="0"/>
+        </w:rPr>
+        <w:t>• Perfilar el dataset mediante reglas deterministas, expresiones regulares, heurística de tipos y estadística descriptiva.</w:t>
+      </w:r>
+    </w:p>
+    <w:p>
+      <w:pPr/>
+      <w:r>
+        <w:rPr>
+          <w:b w:val="0"/>
+          <w:i w:val="0"/>
+        </w:rPr>
+        <w:t>• Presentar hallazgos reproducibles con severidad, columna afectada, recuento, porcentaje y muestra de evidencia.</w:t>
+      </w:r>
+    </w:p>
+    <w:p>
+      <w:pPr/>
+      <w:r>
+        <w:rPr>
+          <w:b w:val="0"/>
+          <w:i w:val="0"/>
+        </w:rPr>
+        <w:t>• Generar un diagnóstico asistido a partir de hallazgos estructurados, sin entregar el dataset completo al modelo.</w:t>
+      </w:r>
+    </w:p>
+    <w:p>
+      <w:pPr/>
+      <w:r>
+        <w:rPr>
+          <w:b w:val="0"/>
+          <w:i w:val="0"/>
+        </w:rPr>
+        <w:t>• Generar o respaldar scripts Python/Pandas orientados a limpieza y asistencia del proceso de remediación.</w:t>
+      </w:r>
+    </w:p>
+    <w:p>
+      <w:pPr/>
+      <w:r>
+        <w:rPr>
+          <w:b w:val="0"/>
+          <w:i w:val="0"/>
+        </w:rPr>
+        <w:t>• Validar automáticamente el script antes de revisión humana, verificando columnas, cobertura de hallazgos, operaciones destructivas y uso de Pandas.</w:t>
+      </w:r>
+    </w:p>
+    <w:p>
+      <w:pPr/>
+      <w:r>
+        <w:rPr>
+          <w:b w:val="0"/>
+          <w:i w:val="0"/>
+        </w:rPr>
+        <w:t>• Exportar reporte PDF y anexos técnicos JSON/CSV para trazabilidad académica y experimental.</w:t>
       </w:r>
     </w:p>
     <w:p>
@@ -5780,39 +5711,61 @@
         <w:pStyle w:val="Heading3"/>
       </w:pPr>
       <w:r>
-        <w:lastRenderedPageBreak/>
+        <w:rPr>
+          <w:b w:val="0"/>
+          <w:i w:val="0"/>
+        </w:rPr>
         <w:t>Requisitos no funcionales</w:t>
       </w:r>
     </w:p>
     <w:p>
-      <w:r>
-        <w:t>Los requisitos no funcionales principales son: arquitectura local-</w:t>
-      </w:r>
-      <w:proofErr w:type="spellStart"/>
-      <w:r>
-        <w:t>first</w:t>
-      </w:r>
-      <w:proofErr w:type="spellEnd"/>
-      <w:r>
-        <w:t xml:space="preserve">, privacidad, reproducibilidad, trazabilidad, </w:t>
-      </w:r>
-      <w:r>
-        <w:t>minimización</w:t>
-      </w:r>
-      <w:r>
-        <w:t xml:space="preserve"> de datos, </w:t>
-      </w:r>
-      <w:r>
-        <w:t>separación</w:t>
-      </w:r>
-      <w:r>
-        <w:t xml:space="preserve"> entre evidencia e </w:t>
-      </w:r>
-      <w:r>
-        <w:t>interpretación</w:t>
-      </w:r>
-      <w:r>
-        <w:t>, transparencia para el usuario y control humano antes de acciones destructivas.</w:t>
+      <w:pPr/>
+      <w:r>
+        <w:rPr>
+          <w:b w:val="0"/>
+          <w:i w:val="0"/>
+        </w:rPr>
+        <w:t>• Privacidad desde el diseño: el archivo crudo se procesa localmente y no se envía por defecto a proveedores externos.</w:t>
+      </w:r>
+    </w:p>
+    <w:p>
+      <w:pPr/>
+      <w:r>
+        <w:rPr>
+          <w:b w:val="0"/>
+          <w:i w:val="0"/>
+        </w:rPr>
+        <w:t>• Reproducibilidad: los hallazgos del motor determinista deben depender de reglas explícitas y no de interpretación probabilística.</w:t>
+      </w:r>
+    </w:p>
+    <w:p>
+      <w:pPr/>
+      <w:r>
+        <w:rPr>
+          <w:b w:val="0"/>
+          <w:i w:val="0"/>
+        </w:rPr>
+        <w:t>• Trazabilidad: cada etapa debe indicar qué recibe, qué produce y qué evidencia deja para etapas posteriores.</w:t>
+      </w:r>
+    </w:p>
+    <w:p>
+      <w:pPr/>
+      <w:r>
+        <w:rPr>
+          <w:b w:val="0"/>
+          <w:i w:val="0"/>
+        </w:rPr>
+        <w:t>• Gobernanza HITL: los scripts generados no se aplican automáticamente; requieren revisión y aprobación humana.</w:t>
+      </w:r>
+    </w:p>
+    <w:p>
+      <w:pPr/>
+      <w:r>
+        <w:rPr>
+          <w:b w:val="0"/>
+          <w:i w:val="0"/>
+        </w:rPr>
+        <w:t>• Claridad de interfaz: la pantalla principal debe mostrar decisiones operativas, dejando los detalles exhaustivos para anexos o reportes exportables.</w:t>
       </w:r>
     </w:p>
     <w:p>
@@ -5820,52 +5773,68 @@
         <w:pStyle w:val="Heading2"/>
       </w:pPr>
       <w:r>
-        <w:t xml:space="preserve"> Descripcion de la herramienta software desarrollada</w:t>
-      </w:r>
-    </w:p>
-    <w:p>
-      <w:r>
-        <w:t xml:space="preserve">AURA se implementa como una </w:t>
-      </w:r>
-      <w:r>
-        <w:t>aplicación</w:t>
-      </w:r>
-      <w:r>
-        <w:t xml:space="preserve"> web que organiza el proceso en etapas: carga local, perfilamiento, diagnostico, </w:t>
-      </w:r>
-      <w:r>
-        <w:t>generación</w:t>
-      </w:r>
-      <w:r>
-        <w:t xml:space="preserve"> de script, </w:t>
-      </w:r>
-      <w:r>
-        <w:t>revisión</w:t>
-      </w:r>
-      <w:r>
-        <w:t xml:space="preserve"> humana, </w:t>
-      </w:r>
-      <w:r>
-        <w:t>exportación</w:t>
-      </w:r>
-      <w:r>
-        <w:t xml:space="preserve"> y laboratorio experimental. Esta estructura evita que el usuario confunda el perfil determinista del </w:t>
-      </w:r>
-      <w:proofErr w:type="spellStart"/>
-      <w:r>
-        <w:t>dataset</w:t>
-      </w:r>
-      <w:proofErr w:type="spellEnd"/>
-      <w:r>
-        <w:t xml:space="preserve"> con la </w:t>
-      </w:r>
-      <w:proofErr w:type="spellStart"/>
-      <w:r>
-        <w:t>interpretacion</w:t>
-      </w:r>
-      <w:proofErr w:type="spellEnd"/>
-      <w:r>
-        <w:t xml:space="preserve"> generada por un LLM.</w:t>
+        <w:rPr>
+          <w:b w:val="0"/>
+          <w:i w:val="0"/>
+        </w:rPr>
+        <w:t>Descripción de la herramienta software desarrollada</w:t>
+      </w:r>
+    </w:p>
+    <w:p>
+      <w:pPr/>
+      <w:r>
+        <w:rPr>
+          <w:b w:val="0"/>
+          <w:i w:val="0"/>
+        </w:rPr>
+        <w:t>AURA se implementa como una aplicación web organizada en etapas: carga local, perfilamiento determinista, diagnóstico asistido, generación de script, revisión humana, exportación y laboratorio experimental. La reorganización del flujo evita mezclar evidencia determinista con interpretación asistida, y permite que cada etapa responda a un objetivo específico del TFM.</w:t>
+      </w:r>
+    </w:p>
+    <w:p>
+      <w:pPr/>
+      <w:r>
+        <w:drawing>
+          <wp:inline xmlns:a="http://schemas.openxmlformats.org/drawingml/2006/main" xmlns:pic="http://schemas.openxmlformats.org/drawingml/2006/picture">
+            <wp:extent cx="5852160" cy="3840480"/>
+            <wp:docPr id="5127" name="Picture 5127"/>
+            <wp:cNvGraphicFramePr>
+              <a:graphicFrameLocks noChangeAspect="1"/>
+            </wp:cNvGraphicFramePr>
+            <a:graphic>
+              <a:graphicData uri="http://schemas.openxmlformats.org/drawingml/2006/picture">
+                <pic:pic>
+                  <pic:nvPicPr>
+                    <pic:cNvPr id="0" name="aura-arquitectura-flujo.png"/>
+                    <pic:cNvPicPr/>
+                  </pic:nvPicPr>
+                  <pic:blipFill>
+                    <a:blip r:embed="rId16"/>
+                    <a:stretch>
+                      <a:fillRect/>
+                    </a:stretch>
+                  </pic:blipFill>
+                  <pic:spPr>
+                    <a:xfrm>
+                      <a:off x="0" y="0"/>
+                      <a:ext cx="5852160" cy="3840480"/>
+                    </a:xfrm>
+                    <a:prstGeom prst="rect"/>
+                  </pic:spPr>
+                </pic:pic>
+              </a:graphicData>
+            </a:graphic>
+          </wp:inline>
+        </w:drawing>
+      </w:r>
+    </w:p>
+    <w:p>
+      <w:pPr/>
+      <w:r>
+        <w:rPr>
+          <w:b w:val="0"/>
+          <w:i/>
+        </w:rPr>
+        <w:t>Figura 5.1. Arquitectura funcional local-first de AURA y trazabilidad con los objetivos específicos.</w:t>
       </w:r>
     </w:p>
     <w:p>
@@ -5873,106 +5842,61 @@
         <w:pStyle w:val="Heading3"/>
       </w:pPr>
       <w:r>
+        <w:rPr>
+          <w:b w:val="0"/>
+          <w:i w:val="0"/>
+        </w:rPr>
         <w:t>Proceso de desarrollo, fases e hitos</w:t>
       </w:r>
     </w:p>
     <w:p>
-      <w:r>
-        <w:t xml:space="preserve">El desarrollo se ha realizado de forma incremental. Primero se </w:t>
-      </w:r>
-      <w:r>
-        <w:t>implementó</w:t>
-      </w:r>
-      <w:r>
-        <w:t xml:space="preserve"> la lectura local de CSV y el perfilamiento del </w:t>
-      </w:r>
-      <w:proofErr w:type="spellStart"/>
-      <w:r>
-        <w:t>dataset</w:t>
-      </w:r>
-      <w:proofErr w:type="spellEnd"/>
-      <w:r>
-        <w:t xml:space="preserve">. </w:t>
-      </w:r>
-      <w:proofErr w:type="spellStart"/>
-      <w:r>
-        <w:t>Despues</w:t>
-      </w:r>
-      <w:proofErr w:type="spellEnd"/>
-      <w:r>
-        <w:t xml:space="preserve"> se </w:t>
-      </w:r>
-      <w:proofErr w:type="spellStart"/>
-      <w:r>
-        <w:t>incorporo</w:t>
-      </w:r>
-      <w:proofErr w:type="spellEnd"/>
-      <w:r>
-        <w:t xml:space="preserve"> el motor determinista con reglas, expresiones regulares, </w:t>
-      </w:r>
-      <w:proofErr w:type="spellStart"/>
-      <w:r>
-        <w:t>heuristicas</w:t>
-      </w:r>
-      <w:proofErr w:type="spellEnd"/>
-      <w:r>
-        <w:t xml:space="preserve"> de tipos y </w:t>
-      </w:r>
-      <w:proofErr w:type="spellStart"/>
-      <w:r>
-        <w:t>estadistica</w:t>
-      </w:r>
-      <w:proofErr w:type="spellEnd"/>
-      <w:r>
-        <w:t xml:space="preserve"> descriptiva. Posteriormente se </w:t>
-      </w:r>
-      <w:proofErr w:type="spellStart"/>
-      <w:r>
-        <w:t>agrego</w:t>
-      </w:r>
-      <w:proofErr w:type="spellEnd"/>
-      <w:r>
-        <w:t xml:space="preserve"> el paquete estructurado de hallazgos, la etapa LLM, la </w:t>
-      </w:r>
-      <w:proofErr w:type="spellStart"/>
-      <w:r>
-        <w:t>generacion</w:t>
-      </w:r>
-      <w:proofErr w:type="spellEnd"/>
-      <w:r>
-        <w:t xml:space="preserve"> de scripts, la </w:t>
-      </w:r>
-      <w:proofErr w:type="spellStart"/>
-      <w:r>
-        <w:t>validacion</w:t>
-      </w:r>
-      <w:proofErr w:type="spellEnd"/>
-      <w:r>
-        <w:t xml:space="preserve"> </w:t>
-      </w:r>
-      <w:proofErr w:type="spellStart"/>
-      <w:r>
-        <w:t>automatica</w:t>
-      </w:r>
-      <w:proofErr w:type="spellEnd"/>
-      <w:r>
-        <w:t xml:space="preserve">, la </w:t>
-      </w:r>
-      <w:proofErr w:type="spellStart"/>
-      <w:r>
-        <w:t>revision</w:t>
-      </w:r>
-      <w:proofErr w:type="spellEnd"/>
-      <w:r>
-        <w:t xml:space="preserve"> humana y el laboratorio experimental local/</w:t>
-      </w:r>
-      <w:proofErr w:type="spellStart"/>
-      <w:r>
-        <w:t>cloud</w:t>
-      </w:r>
-      <w:proofErr w:type="spellEnd"/>
-      <w:r>
-        <w:t>.</w:t>
+      <w:pPr/>
+      <w:r>
+        <w:rPr>
+          <w:b w:val="0"/>
+          <w:i w:val="0"/>
+        </w:rPr>
+        <w:t>• Fase 1: entrada local-first y perfilamiento inicial del CSV en el navegador.</w:t>
+      </w:r>
+    </w:p>
+    <w:p>
+      <w:pPr/>
+      <w:r>
+        <w:rPr>
+          <w:b w:val="0"/>
+          <w:i w:val="0"/>
+        </w:rPr>
+        <w:t>• Fase 2: motor determinista con reglas explícitas, expresiones regulares, heurística de tipos y estadística descriptiva.</w:t>
+      </w:r>
+    </w:p>
+    <w:p>
+      <w:pPr/>
+      <w:r>
+        <w:rPr>
+          <w:b w:val="0"/>
+          <w:i w:val="0"/>
+        </w:rPr>
+        <w:t>• Fase 3: diagnóstico asistido sobre hallazgos estructurados, separando interpretación de evidencia primaria.</w:t>
+      </w:r>
+    </w:p>
+    <w:p>
+      <w:pPr/>
+      <w:r>
+        <w:rPr>
+          <w:b w:val="0"/>
+          <w:i w:val="0"/>
+        </w:rPr>
+        <w:t>• Fase 4: generación de script Python/Pandas con respaldo determinista si el proveedor LLM no devuelve salida estructurada.</w:t>
+      </w:r>
+    </w:p>
+    <w:p>
+      <w:pPr/>
+      <w:r>
+        <w:rPr>
+          <w:b w:val="0"/>
+          <w:i w:val="0"/>
+        </w:rPr>
+        <w:t>• Fase 5: revisión humana, simulación y exportación de evidencia para anexar al TFM.</w:t>
       </w:r>
     </w:p>
     <w:p>
@@ -5980,81 +5904,81 @@
         <w:pStyle w:val="Heading3"/>
       </w:pPr>
       <w:r>
-        <w:t>5.2.2 Arquitectura de cuatro capas</w:t>
-      </w:r>
-    </w:p>
-    <w:p>
-      <w:r>
-        <w:t>La arquitectura se organiza en cuatro capas: Capa 0 local-</w:t>
-      </w:r>
-      <w:proofErr w:type="spellStart"/>
-      <w:r>
-        <w:t>first</w:t>
-      </w:r>
-      <w:proofErr w:type="spellEnd"/>
-      <w:r>
-        <w:t xml:space="preserve">, responsable de cargar y procesar datos en el navegador; Capa 1 determinista, responsable del perfilamiento y hallazgos reproducibles; Capa 2 cognitiva, responsable de </w:t>
-      </w:r>
-      <w:proofErr w:type="spellStart"/>
-      <w:r>
-        <w:t>diagnostico</w:t>
-      </w:r>
-      <w:proofErr w:type="spellEnd"/>
-      <w:r>
-        <w:t xml:space="preserve"> y </w:t>
-      </w:r>
-      <w:proofErr w:type="spellStart"/>
-      <w:r>
-        <w:t>generacion</w:t>
-      </w:r>
-      <w:proofErr w:type="spellEnd"/>
-      <w:r>
-        <w:t xml:space="preserve"> de scripts con LLM; y Capa 3 de gobernanza, responsable de </w:t>
-      </w:r>
-      <w:proofErr w:type="spellStart"/>
-      <w:r>
-        <w:t>revision</w:t>
-      </w:r>
-      <w:proofErr w:type="spellEnd"/>
-      <w:r>
-        <w:t xml:space="preserve"> humana, </w:t>
-      </w:r>
-      <w:proofErr w:type="spellStart"/>
-      <w:r>
-        <w:t>exportacion</w:t>
-      </w:r>
-      <w:proofErr w:type="spellEnd"/>
-      <w:r>
-        <w:t xml:space="preserve">, </w:t>
-      </w:r>
-      <w:proofErr w:type="spellStart"/>
-      <w:r>
-        <w:t>simulacion</w:t>
-      </w:r>
-      <w:proofErr w:type="spellEnd"/>
-      <w:r>
-        <w:t xml:space="preserve"> y </w:t>
-      </w:r>
-      <w:proofErr w:type="spellStart"/>
-      <w:r>
-        <w:t>comparacion</w:t>
-      </w:r>
-      <w:proofErr w:type="spellEnd"/>
-      <w:r>
-        <w:t xml:space="preserve"> experimental.</w:t>
-      </w:r>
-    </w:p>
-    <w:p>
-      <w:r>
-        <w:t xml:space="preserve">En el documento final deben insertarse diagramas de esta arquitectura y capturas de pantalla de las etapas principales: carga, Perfilar, hallazgos, paquete estructurado, Diagnostico, Script, </w:t>
-      </w:r>
-      <w:proofErr w:type="spellStart"/>
-      <w:r>
-        <w:t>Revision</w:t>
-      </w:r>
-      <w:proofErr w:type="spellEnd"/>
-      <w:r>
-        <w:t>, Exportar y Laboratorio experimental.</w:t>
+        <w:rPr>
+          <w:b w:val="0"/>
+          <w:i w:val="0"/>
+        </w:rPr>
+        <w:t>Componentes técnicos principales</w:t>
+      </w:r>
+    </w:p>
+    <w:p>
+      <w:pPr/>
+      <w:r>
+        <w:rPr>
+          <w:b w:val="0"/>
+          <w:i w:val="0"/>
+        </w:rPr>
+        <w:t>• csvService.ts: lectura y parsing local del CSV.</w:t>
+      </w:r>
+    </w:p>
+    <w:p>
+      <w:pPr/>
+      <w:r>
+        <w:rPr>
+          <w:b w:val="0"/>
+          <w:i w:val="0"/>
+        </w:rPr>
+        <w:t>• auditEngine.ts: motor de auditoría determinista y generación de hallazgos reproducibles.</w:t>
+      </w:r>
+    </w:p>
+    <w:p>
+      <w:pPr/>
+      <w:r>
+        <w:rPr>
+          <w:b w:val="0"/>
+          <w:i w:val="0"/>
+        </w:rPr>
+        <w:t>• executionEvidence.ts: fingerprint del dataset y trazas de ejecución.</w:t>
+      </w:r>
+    </w:p>
+    <w:p>
+      <w:pPr/>
+      <w:r>
+        <w:rPr>
+          <w:b w:val="0"/>
+          <w:i w:val="0"/>
+        </w:rPr>
+        <w:t>• DiagnosisStep.tsx: etapa de diagnóstico asistido basada en hallazgos estructurados.</w:t>
+      </w:r>
+    </w:p>
+    <w:p>
+      <w:pPr/>
+      <w:r>
+        <w:rPr>
+          <w:b w:val="0"/>
+          <w:i w:val="0"/>
+        </w:rPr>
+        <w:t>• deterministicScriptBuilder.ts: respaldo determinista para generar scripts Pandas cuando el proveedor no entrega JSON válido.</w:t>
+      </w:r>
+    </w:p>
+    <w:p>
+      <w:pPr/>
+      <w:r>
+        <w:rPr>
+          <w:b w:val="0"/>
+          <w:i w:val="0"/>
+        </w:rPr>
+        <w:t>• scriptValidationService.ts: validación de columnas, operaciones destructivas, cobertura de hallazgos y revisión humana.</w:t>
+      </w:r>
+    </w:p>
+    <w:p>
+      <w:pPr/>
+      <w:r>
+        <w:rPr>
+          <w:b w:val="0"/>
+          <w:i w:val="0"/>
+        </w:rPr>
+        <w:t>• ReviewStep.tsx y ScriptReview.tsx: revisión HITL, edición, aprobación y simulación segura.</w:t>
       </w:r>
     </w:p>
     <w:p>
@@ -6062,133 +5986,533 @@
         <w:pStyle w:val="Heading3"/>
       </w:pPr>
       <w:r>
-        <w:t xml:space="preserve">5.2.3 Componentes </w:t>
-      </w:r>
-      <w:proofErr w:type="spellStart"/>
-      <w:r>
-        <w:t>tecnicos</w:t>
-      </w:r>
-      <w:proofErr w:type="spellEnd"/>
-      <w:r>
-        <w:t xml:space="preserve"> principales</w:t>
-      </w:r>
-    </w:p>
-    <w:p>
-      <w:r>
-        <w:t xml:space="preserve">Los componentes principales son: </w:t>
-      </w:r>
-      <w:proofErr w:type="spellStart"/>
-      <w:r>
-        <w:t>csvService.ts</w:t>
-      </w:r>
-      <w:proofErr w:type="spellEnd"/>
-      <w:r>
-        <w:t xml:space="preserve"> para </w:t>
-      </w:r>
-      <w:proofErr w:type="spellStart"/>
-      <w:r>
-        <w:t>parsing</w:t>
-      </w:r>
-      <w:proofErr w:type="spellEnd"/>
-      <w:r>
-        <w:t xml:space="preserve"> local; </w:t>
-      </w:r>
-      <w:proofErr w:type="spellStart"/>
-      <w:r>
-        <w:t>auditEngine.ts</w:t>
-      </w:r>
-      <w:proofErr w:type="spellEnd"/>
-      <w:r>
-        <w:t xml:space="preserve"> para auditoria determinista; </w:t>
-      </w:r>
-      <w:proofErr w:type="spellStart"/>
-      <w:r>
-        <w:t>executionEvidence.ts</w:t>
-      </w:r>
-      <w:proofErr w:type="spellEnd"/>
-      <w:r>
-        <w:t xml:space="preserve"> para </w:t>
-      </w:r>
-      <w:proofErr w:type="spellStart"/>
-      <w:r>
-        <w:t>fingerprint</w:t>
-      </w:r>
-      <w:proofErr w:type="spellEnd"/>
-      <w:r>
-        <w:t xml:space="preserve"> y trazas; </w:t>
-      </w:r>
-      <w:proofErr w:type="spellStart"/>
-      <w:r>
-        <w:t>prompts.ts</w:t>
-      </w:r>
-      <w:proofErr w:type="spellEnd"/>
-      <w:r>
-        <w:t xml:space="preserve"> para construir la entrada estructurada; </w:t>
-      </w:r>
-      <w:proofErr w:type="spellStart"/>
-      <w:r>
-        <w:t>DiagnosisStep.tsx</w:t>
-      </w:r>
-      <w:proofErr w:type="spellEnd"/>
-      <w:r>
-        <w:t xml:space="preserve"> para diagnostico asistido; </w:t>
-      </w:r>
-      <w:proofErr w:type="spellStart"/>
-      <w:r>
-        <w:lastRenderedPageBreak/>
-        <w:t>ScriptGenerationStep.tsx</w:t>
-      </w:r>
-      <w:proofErr w:type="spellEnd"/>
-      <w:r>
-        <w:t xml:space="preserve"> para </w:t>
-      </w:r>
-      <w:proofErr w:type="spellStart"/>
-      <w:r>
-        <w:t>generacion</w:t>
-      </w:r>
-      <w:proofErr w:type="spellEnd"/>
-      <w:r>
-        <w:t xml:space="preserve"> de scripts; </w:t>
-      </w:r>
-      <w:proofErr w:type="spellStart"/>
-      <w:r>
-        <w:t>scriptValidationService.ts</w:t>
-      </w:r>
-      <w:proofErr w:type="spellEnd"/>
-      <w:r>
-        <w:t xml:space="preserve"> para </w:t>
-      </w:r>
-      <w:proofErr w:type="spellStart"/>
-      <w:r>
-        <w:t>validacion</w:t>
-      </w:r>
-      <w:proofErr w:type="spellEnd"/>
-      <w:r>
-        <w:t xml:space="preserve">; </w:t>
-      </w:r>
-      <w:proofErr w:type="spellStart"/>
-      <w:r>
-        <w:t>ReviewStep.tsx</w:t>
-      </w:r>
-      <w:proofErr w:type="spellEnd"/>
-      <w:r>
-        <w:t xml:space="preserve"> para HITL; y </w:t>
-      </w:r>
-      <w:proofErr w:type="spellStart"/>
-      <w:r>
-        <w:t>BenchmarkLab.tsx</w:t>
-      </w:r>
-      <w:proofErr w:type="spellEnd"/>
-      <w:r>
-        <w:t xml:space="preserve"> para </w:t>
-      </w:r>
-      <w:proofErr w:type="spellStart"/>
-      <w:r>
-        <w:t>comparacion</w:t>
-      </w:r>
-      <w:proofErr w:type="spellEnd"/>
-      <w:r>
-        <w:t xml:space="preserve"> experimental.</w:t>
+        <w:rPr>
+          <w:b w:val="0"/>
+          <w:i w:val="0"/>
+        </w:rPr>
+        <w:t>Evidencia de funcionamiento con datasets sintéticos</w:t>
+      </w:r>
+    </w:p>
+    <w:p>
+      <w:pPr/>
+      <w:r>
+        <w:rPr>
+          <w:b w:val="0"/>
+          <w:i w:val="0"/>
+        </w:rPr>
+        <w:t>Para esta entrega se ejecutó AURA con tres datasets pequeños incluidos en el repositorio: clientes_sucio.csv, inventario_sucio.csv y operaciones_sucio.csv. Estos datasets activan reglas de duplicados, placeholders, espacios, formatos inválidos, tipos disfrazados y coherencia temporal.</w:t>
+      </w:r>
+    </w:p>
+    <w:tbl>
+      <w:tblPr>
+        <w:tblStyle w:val="TableGrid"/>
+        <w:tblW w:type="auto" w:w="0"/>
+        <w:tblLook w:firstColumn="1" w:firstRow="1" w:lastColumn="0" w:lastRow="0" w:noHBand="0" w:noVBand="1" w:val="04A0"/>
+      </w:tblPr>
+      <w:tblGrid>
+        <w:gridCol w:w="1814"/>
+        <w:gridCol w:w="1814"/>
+        <w:gridCol w:w="1814"/>
+        <w:gridCol w:w="1814"/>
+        <w:gridCol w:w="1814"/>
+      </w:tblGrid>
+      <w:tr>
+        <w:tc>
+          <w:tcPr>
+            <w:tcW w:type="dxa" w:w="1814"/>
+          </w:tcPr>
+          <w:p>
+            <w:r>
+              <w:t>Dataset</w:t>
+            </w:r>
+          </w:p>
+        </w:tc>
+        <w:tc>
+          <w:tcPr>
+            <w:tcW w:type="dxa" w:w="1814"/>
+          </w:tcPr>
+          <w:p>
+            <w:r>
+              <w:t>Filas</w:t>
+            </w:r>
+          </w:p>
+        </w:tc>
+        <w:tc>
+          <w:tcPr>
+            <w:tcW w:type="dxa" w:w="1814"/>
+          </w:tcPr>
+          <w:p>
+            <w:r>
+              <w:t>Columnas</w:t>
+            </w:r>
+          </w:p>
+        </w:tc>
+        <w:tc>
+          <w:tcPr>
+            <w:tcW w:type="dxa" w:w="1814"/>
+          </w:tcPr>
+          <w:p>
+            <w:r>
+              <w:t>Hallazgos</w:t>
+            </w:r>
+          </w:p>
+        </w:tc>
+        <w:tc>
+          <w:tcPr>
+            <w:tcW w:type="dxa" w:w="1814"/>
+          </w:tcPr>
+          <w:p>
+            <w:r>
+              <w:t>Score</w:t>
+            </w:r>
+          </w:p>
+        </w:tc>
+      </w:tr>
+      <w:tr>
+        <w:tc>
+          <w:tcPr>
+            <w:tcW w:type="dxa" w:w="1814"/>
+          </w:tcPr>
+          <w:p>
+            <w:r>
+              <w:t>clientes_sucio.csv</w:t>
+            </w:r>
+          </w:p>
+        </w:tc>
+        <w:tc>
+          <w:tcPr>
+            <w:tcW w:type="dxa" w:w="1814"/>
+          </w:tcPr>
+          <w:p>
+            <w:r>
+              <w:t>6</w:t>
+            </w:r>
+          </w:p>
+        </w:tc>
+        <w:tc>
+          <w:tcPr>
+            <w:tcW w:type="dxa" w:w="1814"/>
+          </w:tcPr>
+          <w:p>
+            <w:r>
+              <w:t>5</w:t>
+            </w:r>
+          </w:p>
+        </w:tc>
+        <w:tc>
+          <w:tcPr>
+            <w:tcW w:type="dxa" w:w="1814"/>
+          </w:tcPr>
+          <w:p>
+            <w:r>
+              <w:t>7</w:t>
+            </w:r>
+          </w:p>
+        </w:tc>
+        <w:tc>
+          <w:tcPr>
+            <w:tcW w:type="dxa" w:w="1814"/>
+          </w:tcPr>
+          <w:p>
+            <w:r>
+              <w:t>18/100</w:t>
+            </w:r>
+          </w:p>
+        </w:tc>
+      </w:tr>
+      <w:tr>
+        <w:tc>
+          <w:tcPr>
+            <w:tcW w:type="dxa" w:w="1814"/>
+          </w:tcPr>
+          <w:p>
+            <w:r>
+              <w:t>inventario_sucio.csv</w:t>
+            </w:r>
+          </w:p>
+        </w:tc>
+        <w:tc>
+          <w:tcPr>
+            <w:tcW w:type="dxa" w:w="1814"/>
+          </w:tcPr>
+          <w:p>
+            <w:r>
+              <w:t>6</w:t>
+            </w:r>
+          </w:p>
+        </w:tc>
+        <w:tc>
+          <w:tcPr>
+            <w:tcW w:type="dxa" w:w="1814"/>
+          </w:tcPr>
+          <w:p>
+            <w:r>
+              <w:t>6</w:t>
+            </w:r>
+          </w:p>
+        </w:tc>
+        <w:tc>
+          <w:tcPr>
+            <w:tcW w:type="dxa" w:w="1814"/>
+          </w:tcPr>
+          <w:p>
+            <w:r>
+              <w:t>8</w:t>
+            </w:r>
+          </w:p>
+        </w:tc>
+        <w:tc>
+          <w:tcPr>
+            <w:tcW w:type="dxa" w:w="1814"/>
+          </w:tcPr>
+          <w:p>
+            <w:r>
+              <w:t>15/100</w:t>
+            </w:r>
+          </w:p>
+        </w:tc>
+      </w:tr>
+      <w:tr>
+        <w:tc>
+          <w:tcPr>
+            <w:tcW w:type="dxa" w:w="1814"/>
+          </w:tcPr>
+          <w:p>
+            <w:r>
+              <w:t>operaciones_sucio.csv</w:t>
+            </w:r>
+          </w:p>
+        </w:tc>
+        <w:tc>
+          <w:tcPr>
+            <w:tcW w:type="dxa" w:w="1814"/>
+          </w:tcPr>
+          <w:p>
+            <w:r>
+              <w:t>6</w:t>
+            </w:r>
+          </w:p>
+        </w:tc>
+        <w:tc>
+          <w:tcPr>
+            <w:tcW w:type="dxa" w:w="1814"/>
+          </w:tcPr>
+          <w:p>
+            <w:r>
+              <w:t>6</w:t>
+            </w:r>
+          </w:p>
+        </w:tc>
+        <w:tc>
+          <w:tcPr>
+            <w:tcW w:type="dxa" w:w="1814"/>
+          </w:tcPr>
+          <w:p>
+            <w:r>
+              <w:t>8</w:t>
+            </w:r>
+          </w:p>
+        </w:tc>
+        <w:tc>
+          <w:tcPr>
+            <w:tcW w:type="dxa" w:w="1814"/>
+          </w:tcPr>
+          <w:p>
+            <w:r>
+              <w:t>24/100</w:t>
+            </w:r>
+          </w:p>
+        </w:tc>
+      </w:tr>
+    </w:tbl>
+    <w:p>
+      <w:r>
+        <w:rPr>
+          <w:i/>
+        </w:rPr>
+        <w:t>Tabla 5.1. Resultados observados durante la ejecución de AURA con tres datasets sintéticos de prueba.</w:t>
+      </w:r>
+    </w:p>
+    <w:p>
+      <w:pPr/>
+      <w:r>
+        <w:drawing>
+          <wp:inline xmlns:a="http://schemas.openxmlformats.org/drawingml/2006/main" xmlns:pic="http://schemas.openxmlformats.org/drawingml/2006/picture">
+            <wp:extent cx="5852160" cy="3706368"/>
+            <wp:docPr id="5128" name="Picture 5128"/>
+            <wp:cNvGraphicFramePr>
+              <a:graphicFrameLocks noChangeAspect="1"/>
+            </wp:cNvGraphicFramePr>
+            <a:graphic>
+              <a:graphicData uri="http://schemas.openxmlformats.org/drawingml/2006/picture">
+                <pic:pic>
+                  <pic:nvPicPr>
+                    <pic:cNvPr id="0" name="aura-clientes-perfil.png"/>
+                    <pic:cNvPicPr/>
+                  </pic:nvPicPr>
+                  <pic:blipFill>
+                    <a:blip r:embed="rId17"/>
+                    <a:stretch>
+                      <a:fillRect/>
+                    </a:stretch>
+                  </pic:blipFill>
+                  <pic:spPr>
+                    <a:xfrm>
+                      <a:off x="0" y="0"/>
+                      <a:ext cx="5852160" cy="3706368"/>
+                    </a:xfrm>
+                    <a:prstGeom prst="rect"/>
+                  </pic:spPr>
+                </pic:pic>
+              </a:graphicData>
+            </a:graphic>
+          </wp:inline>
+        </w:drawing>
+      </w:r>
+    </w:p>
+    <w:p>
+      <w:pPr/>
+      <w:r>
+        <w:rPr>
+          <w:b w:val="0"/>
+          <w:i/>
+        </w:rPr>
+        <w:t>Figura 5.2. Perfilamiento del dataset clientes_sucio.csv: caracterización, reglas activadas y salida estructurada.</w:t>
+      </w:r>
+    </w:p>
+    <w:p>
+      <w:pPr/>
+      <w:r>
+        <w:drawing>
+          <wp:inline xmlns:a="http://schemas.openxmlformats.org/drawingml/2006/main" xmlns:pic="http://schemas.openxmlformats.org/drawingml/2006/picture">
+            <wp:extent cx="5852160" cy="3706368"/>
+            <wp:docPr id="5129" name="Picture 5129"/>
+            <wp:cNvGraphicFramePr>
+              <a:graphicFrameLocks noChangeAspect="1"/>
+            </wp:cNvGraphicFramePr>
+            <a:graphic>
+              <a:graphicData uri="http://schemas.openxmlformats.org/drawingml/2006/picture">
+                <pic:pic>
+                  <pic:nvPicPr>
+                    <pic:cNvPr id="0" name="aura-inventario-perfil.png"/>
+                    <pic:cNvPicPr/>
+                  </pic:nvPicPr>
+                  <pic:blipFill>
+                    <a:blip r:embed="rId18"/>
+                    <a:stretch>
+                      <a:fillRect/>
+                    </a:stretch>
+                  </pic:blipFill>
+                  <pic:spPr>
+                    <a:xfrm>
+                      <a:off x="0" y="0"/>
+                      <a:ext cx="5852160" cy="3706368"/>
+                    </a:xfrm>
+                    <a:prstGeom prst="rect"/>
+                  </pic:spPr>
+                </pic:pic>
+              </a:graphicData>
+            </a:graphic>
+          </wp:inline>
+        </w:drawing>
+      </w:r>
+    </w:p>
+    <w:p>
+      <w:pPr/>
+      <w:r>
+        <w:rPr>
+          <w:b w:val="0"/>
+          <w:i/>
+        </w:rPr>
+        <w:t>Figura 5.3. Perfilamiento del dataset inventario_sucio.csv con hallazgos de integridad, tipos y placeholders.</w:t>
+      </w:r>
+    </w:p>
+    <w:p>
+      <w:pPr/>
+      <w:r>
+        <w:drawing>
+          <wp:inline xmlns:a="http://schemas.openxmlformats.org/drawingml/2006/main" xmlns:pic="http://schemas.openxmlformats.org/drawingml/2006/picture">
+            <wp:extent cx="5852160" cy="3706368"/>
+            <wp:docPr id="5130" name="Picture 5130"/>
+            <wp:cNvGraphicFramePr>
+              <a:graphicFrameLocks noChangeAspect="1"/>
+            </wp:cNvGraphicFramePr>
+            <a:graphic>
+              <a:graphicData uri="http://schemas.openxmlformats.org/drawingml/2006/picture">
+                <pic:pic>
+                  <pic:nvPicPr>
+                    <pic:cNvPr id="0" name="aura-operaciones-perfil.png"/>
+                    <pic:cNvPicPr/>
+                  </pic:nvPicPr>
+                  <pic:blipFill>
+                    <a:blip r:embed="rId19"/>
+                    <a:stretch>
+                      <a:fillRect/>
+                    </a:stretch>
+                  </pic:blipFill>
+                  <pic:spPr>
+                    <a:xfrm>
+                      <a:off x="0" y="0"/>
+                      <a:ext cx="5852160" cy="3706368"/>
+                    </a:xfrm>
+                    <a:prstGeom prst="rect"/>
+                  </pic:spPr>
+                </pic:pic>
+              </a:graphicData>
+            </a:graphic>
+          </wp:inline>
+        </w:drawing>
+      </w:r>
+    </w:p>
+    <w:p>
+      <w:pPr/>
+      <w:r>
+        <w:rPr>
+          <w:b w:val="0"/>
+          <w:i/>
+        </w:rPr>
+        <w:t>Figura 5.4. Perfilamiento del dataset operaciones_sucio.csv con problemas temporales, duplicados y formatos inválidos.</w:t>
+      </w:r>
+    </w:p>
+    <w:p>
+      <w:pPr/>
+      <w:r>
+        <w:drawing>
+          <wp:inline xmlns:a="http://schemas.openxmlformats.org/drawingml/2006/main" xmlns:pic="http://schemas.openxmlformats.org/drawingml/2006/picture">
+            <wp:extent cx="5852160" cy="3706368"/>
+            <wp:docPr id="5131" name="Picture 5131"/>
+            <wp:cNvGraphicFramePr>
+              <a:graphicFrameLocks noChangeAspect="1"/>
+            </wp:cNvGraphicFramePr>
+            <a:graphic>
+              <a:graphicData uri="http://schemas.openxmlformats.org/drawingml/2006/picture">
+                <pic:pic>
+                  <pic:nvPicPr>
+                    <pic:cNvPr id="0" name="aura-clientes-diagnostico.png"/>
+                    <pic:cNvPicPr/>
+                  </pic:nvPicPr>
+                  <pic:blipFill>
+                    <a:blip r:embed="rId20"/>
+                    <a:stretch>
+                      <a:fillRect/>
+                    </a:stretch>
+                  </pic:blipFill>
+                  <pic:spPr>
+                    <a:xfrm>
+                      <a:off x="0" y="0"/>
+                      <a:ext cx="5852160" cy="3706368"/>
+                    </a:xfrm>
+                    <a:prstGeom prst="rect"/>
+                  </pic:spPr>
+                </pic:pic>
+              </a:graphicData>
+            </a:graphic>
+          </wp:inline>
+        </w:drawing>
+      </w:r>
+    </w:p>
+    <w:p>
+      <w:pPr/>
+      <w:r>
+        <w:rPr>
+          <w:b w:val="0"/>
+          <w:i/>
+        </w:rPr>
+        <w:t>Figura 5.5. Etapa de diagnóstico asistido: contrato de entrada, problema observado y modo de ejecución.</w:t>
+      </w:r>
+    </w:p>
+    <w:p>
+      <w:pPr/>
+      <w:r>
+        <w:drawing>
+          <wp:inline xmlns:a="http://schemas.openxmlformats.org/drawingml/2006/main" xmlns:pic="http://schemas.openxmlformats.org/drawingml/2006/picture">
+            <wp:extent cx="5852160" cy="3706368"/>
+            <wp:docPr id="5132" name="Picture 5132"/>
+            <wp:cNvGraphicFramePr>
+              <a:graphicFrameLocks noChangeAspect="1"/>
+            </wp:cNvGraphicFramePr>
+            <a:graphic>
+              <a:graphicData uri="http://schemas.openxmlformats.org/drawingml/2006/picture">
+                <pic:pic>
+                  <pic:nvPicPr>
+                    <pic:cNvPr id="0" name="aura-clientes-script.png"/>
+                    <pic:cNvPicPr/>
+                  </pic:nvPicPr>
+                  <pic:blipFill>
+                    <a:blip r:embed="rId21"/>
+                    <a:stretch>
+                      <a:fillRect/>
+                    </a:stretch>
+                  </pic:blipFill>
+                  <pic:spPr>
+                    <a:xfrm>
+                      <a:off x="0" y="0"/>
+                      <a:ext cx="5852160" cy="3706368"/>
+                    </a:xfrm>
+                    <a:prstGeom prst="rect"/>
+                  </pic:spPr>
+                </pic:pic>
+              </a:graphicData>
+            </a:graphic>
+          </wp:inline>
+        </w:drawing>
+      </w:r>
+    </w:p>
+    <w:p>
+      <w:pPr/>
+      <w:r>
+        <w:rPr>
+          <w:b w:val="0"/>
+          <w:i/>
+        </w:rPr>
+        <w:t>Figura 5.6. Generación de script de asistencia con respaldo determinista y matriz de validación automática.</w:t>
+      </w:r>
+    </w:p>
+    <w:p>
+      <w:pPr/>
+      <w:r>
+        <w:drawing>
+          <wp:inline xmlns:a="http://schemas.openxmlformats.org/drawingml/2006/main" xmlns:pic="http://schemas.openxmlformats.org/drawingml/2006/picture">
+            <wp:extent cx="5852160" cy="3706368"/>
+            <wp:docPr id="5133" name="Picture 5133"/>
+            <wp:cNvGraphicFramePr>
+              <a:graphicFrameLocks noChangeAspect="1"/>
+            </wp:cNvGraphicFramePr>
+            <a:graphic>
+              <a:graphicData uri="http://schemas.openxmlformats.org/drawingml/2006/picture">
+                <pic:pic>
+                  <pic:nvPicPr>
+                    <pic:cNvPr id="0" name="aura-clientes-revision.png"/>
+                    <pic:cNvPicPr/>
+                  </pic:nvPicPr>
+                  <pic:blipFill>
+                    <a:blip r:embed="rId22"/>
+                    <a:stretch>
+                      <a:fillRect/>
+                    </a:stretch>
+                  </pic:blipFill>
+                  <pic:spPr>
+                    <a:xfrm>
+                      <a:off x="0" y="0"/>
+                      <a:ext cx="5852160" cy="3706368"/>
+                    </a:xfrm>
+                    <a:prstGeom prst="rect"/>
+                  </pic:spPr>
+                </pic:pic>
+              </a:graphicData>
+            </a:graphic>
+          </wp:inline>
+        </w:drawing>
+      </w:r>
+    </w:p>
+    <w:p>
+      <w:pPr/>
+      <w:r>
+        <w:rPr>
+          <w:b w:val="0"/>
+          <w:i/>
+        </w:rPr>
+        <w:t>Figura 5.7. Revisión humana del script, decisión de aprobación y preparación para simulación.</w:t>
       </w:r>
     </w:p>
     <w:p>
@@ -6196,7 +6520,21 @@
         <w:pStyle w:val="Heading2"/>
       </w:pPr>
       <w:r>
-        <w:t>Evaluacion</w:t>
+        <w:rPr>
+          <w:b w:val="0"/>
+          <w:i w:val="0"/>
+        </w:rPr>
+        <w:t>Evaluación</w:t>
+      </w:r>
+    </w:p>
+    <w:p>
+      <w:pPr/>
+      <w:r>
+        <w:rPr>
+          <w:b w:val="0"/>
+          <w:i w:val="0"/>
+        </w:rPr>
+        <w:t>La evaluación preliminar se centra en dos dimensiones: aplicabilidad técnica y usabilidad del flujo. La aplicabilidad técnica se observa en la capacidad del motor para activar hallazgos reproducibles sobre datasets controlados y en la capacidad del sistema para transformar esos hallazgos en una entrada estructurada para diagnóstico y script. La usabilidad se evalúa mediante la claridad de las etapas y la separación entre perfilamiento, interpretación, script, revisión y exportación.</w:t>
       </w:r>
     </w:p>
     <w:p>
@@ -6204,105 +6542,21 @@
         <w:pStyle w:val="Heading3"/>
       </w:pPr>
       <w:r>
-        <w:t xml:space="preserve">5.3.1 </w:t>
-      </w:r>
-      <w:proofErr w:type="spellStart"/>
-      <w:r>
-        <w:t>Evaluacion</w:t>
-      </w:r>
-      <w:proofErr w:type="spellEnd"/>
-      <w:r>
-        <w:t xml:space="preserve"> de aplicabilidad </w:t>
-      </w:r>
-      <w:proofErr w:type="spellStart"/>
-      <w:r>
-        <w:t>tecnica</w:t>
-      </w:r>
-      <w:proofErr w:type="spellEnd"/>
-    </w:p>
-    <w:p>
-      <w:r>
-        <w:t xml:space="preserve">La aplicabilidad </w:t>
-      </w:r>
-      <w:proofErr w:type="spellStart"/>
-      <w:r>
-        <w:t>tecnica</w:t>
-      </w:r>
-      <w:proofErr w:type="spellEnd"/>
-      <w:r>
-        <w:t xml:space="preserve"> se </w:t>
-      </w:r>
-      <w:proofErr w:type="spellStart"/>
-      <w:r>
-        <w:t>evalua</w:t>
-      </w:r>
-      <w:proofErr w:type="spellEnd"/>
-      <w:r>
-        <w:t xml:space="preserve"> inicialmente mediante el motor determinista sobre un </w:t>
-      </w:r>
-      <w:proofErr w:type="spellStart"/>
-      <w:r>
-        <w:t>dataset</w:t>
-      </w:r>
-      <w:proofErr w:type="spellEnd"/>
-      <w:r>
-        <w:t xml:space="preserve"> </w:t>
-      </w:r>
-      <w:proofErr w:type="spellStart"/>
-      <w:r>
-        <w:t>sintetico</w:t>
-      </w:r>
-      <w:proofErr w:type="spellEnd"/>
-      <w:r>
-        <w:t xml:space="preserve"> con </w:t>
-      </w:r>
-      <w:proofErr w:type="spellStart"/>
-      <w:r>
-        <w:t>ground</w:t>
-      </w:r>
-      <w:proofErr w:type="spellEnd"/>
-      <w:r>
-        <w:t xml:space="preserve"> </w:t>
-      </w:r>
-      <w:proofErr w:type="spellStart"/>
-      <w:r>
-        <w:t>truth</w:t>
-      </w:r>
-      <w:proofErr w:type="spellEnd"/>
-      <w:r>
-        <w:t xml:space="preserve">. Los resultados preliminares reportan </w:t>
-      </w:r>
-      <w:proofErr w:type="spellStart"/>
-      <w:r>
-        <w:t>precision</w:t>
-      </w:r>
-      <w:proofErr w:type="spellEnd"/>
-      <w:r>
-        <w:t xml:space="preserve"> de 37.93%, </w:t>
-      </w:r>
-      <w:proofErr w:type="spellStart"/>
-      <w:r>
-        <w:t>recall</w:t>
-      </w:r>
-      <w:proofErr w:type="spellEnd"/>
-      <w:r>
-        <w:t xml:space="preserve"> de 84.62% y F1-score de 52.38%. Esto muestra un motor reproducible con alta cobertura, pero </w:t>
-      </w:r>
-      <w:proofErr w:type="spellStart"/>
-      <w:r>
-        <w:t>tambien</w:t>
-      </w:r>
-      <w:proofErr w:type="spellEnd"/>
-      <w:r>
-        <w:t xml:space="preserve"> con falsos positivos, lo cual justifica la etapa LLM y la </w:t>
-      </w:r>
-      <w:proofErr w:type="spellStart"/>
-      <w:r>
-        <w:t>revision</w:t>
-      </w:r>
-      <w:proofErr w:type="spellEnd"/>
-      <w:r>
-        <w:t xml:space="preserve"> humana.</w:t>
+        <w:rPr>
+          <w:b w:val="0"/>
+          <w:i w:val="0"/>
+        </w:rPr>
+        <w:t>Evaluación de aplicabilidad técnica</w:t>
+      </w:r>
+    </w:p>
+    <w:p>
+      <w:pPr/>
+      <w:r>
+        <w:rPr>
+          <w:b w:val="0"/>
+          <w:i w:val="0"/>
+        </w:rPr>
+        <w:t>Las pruebas con los tres datasets muestran que el motor detecta anomalías estructurales en archivos de baja complejidad, generando hallazgos con recuento, porcentaje y columna asociada. Además, la generación de script ya no depende exclusivamente de una respuesta perfecta del proveedor LLM: si la salida no contiene un campo python_script válido, AURA construye un script Pandas base a partir de acciones deterministas y lo somete igualmente a validación automática.</w:t>
       </w:r>
     </w:p>
     <w:p>
@@ -6310,68 +6564,21 @@
         <w:pStyle w:val="Heading3"/>
       </w:pPr>
       <w:r>
-        <w:t xml:space="preserve">5.3.2 </w:t>
-      </w:r>
-      <w:proofErr w:type="spellStart"/>
-      <w:r>
-        <w:t>Evaluacion</w:t>
-      </w:r>
-      <w:proofErr w:type="spellEnd"/>
-      <w:r>
-        <w:t xml:space="preserve"> de usabilidad</w:t>
-      </w:r>
-    </w:p>
-    <w:p>
-      <w:r>
-        <w:t xml:space="preserve">Para esta segunda entrega se propone un protocolo inicial de usabilidad basado en tareas: cargar un CSV, interpretar el perfil, localizar hallazgos </w:t>
-      </w:r>
-      <w:proofErr w:type="spellStart"/>
-      <w:r>
-        <w:t>criticos</w:t>
-      </w:r>
-      <w:proofErr w:type="spellEnd"/>
-      <w:r>
-        <w:t xml:space="preserve">, abrir </w:t>
-      </w:r>
-      <w:proofErr w:type="spellStart"/>
-      <w:r>
-        <w:t>diagnostico</w:t>
-      </w:r>
-      <w:proofErr w:type="spellEnd"/>
-      <w:r>
-        <w:t xml:space="preserve">, generar script, revisar/aprobar y exportar evidencia. Las </w:t>
-      </w:r>
-      <w:proofErr w:type="spellStart"/>
-      <w:r>
-        <w:t>metricas</w:t>
-      </w:r>
-      <w:proofErr w:type="spellEnd"/>
-      <w:r>
-        <w:t xml:space="preserve"> sugeridas son tiempo por tarea, tasa de </w:t>
-      </w:r>
-      <w:proofErr w:type="spellStart"/>
-      <w:r>
-        <w:t>finalizacion</w:t>
-      </w:r>
-      <w:proofErr w:type="spellEnd"/>
-      <w:r>
-        <w:t xml:space="preserve">, errores de </w:t>
-      </w:r>
-      <w:proofErr w:type="spellStart"/>
-      <w:r>
-        <w:t>navegacion</w:t>
-      </w:r>
-      <w:proofErr w:type="spellEnd"/>
-      <w:r>
-        <w:t>, claridad percibida y confianza antes/</w:t>
-      </w:r>
-      <w:proofErr w:type="spellStart"/>
-      <w:r>
-        <w:t>despues</w:t>
-      </w:r>
-      <w:proofErr w:type="spellEnd"/>
-      <w:r>
-        <w:t xml:space="preserve"> de revisar el script.</w:t>
+        <w:rPr>
+          <w:b w:val="0"/>
+          <w:i w:val="0"/>
+        </w:rPr>
+        <w:t>Evaluación de usabilidad</w:t>
+      </w:r>
+    </w:p>
+    <w:p>
+      <w:pPr/>
+      <w:r>
+        <w:rPr>
+          <w:b w:val="0"/>
+          <w:i w:val="0"/>
+        </w:rPr>
+        <w:t>El flujo revisado reduce ruido visual y evita que el usuario tenga que interpretar nombres internos de capas o prompts extensos. En Perfilar se muestra caracterización y reglas; en Diagnóstico se muestra el contrato de entrada y el problema observado; en Script se muestra origen, validación y respaldo; y en Revisión se presenta una decisión HITL antes de la simulación. Esta separación favorece una interfaz natural y defendible para el TFM.</w:t>
       </w:r>
     </w:p>
     <w:p>
@@ -6379,44 +6586,21 @@
         <w:pStyle w:val="Heading3"/>
       </w:pPr>
       <w:r>
-        <w:t xml:space="preserve">5.3.3 </w:t>
-      </w:r>
-      <w:proofErr w:type="spellStart"/>
-      <w:r>
-        <w:t>Evaluacion</w:t>
-      </w:r>
-      <w:proofErr w:type="spellEnd"/>
-      <w:r>
-        <w:t xml:space="preserve"> del </w:t>
-      </w:r>
-      <w:proofErr w:type="spellStart"/>
-      <w:r>
-        <w:t>benchmark</w:t>
-      </w:r>
-      <w:proofErr w:type="spellEnd"/>
-      <w:r>
-        <w:t xml:space="preserve"> LLM</w:t>
-      </w:r>
-    </w:p>
-    <w:p>
-      <w:r>
-        <w:t xml:space="preserve">El laboratorio experimental permite comparar modelos locales y </w:t>
-      </w:r>
-      <w:proofErr w:type="spellStart"/>
-      <w:r>
-        <w:t>cloud</w:t>
-      </w:r>
-      <w:proofErr w:type="spellEnd"/>
-      <w:r>
-        <w:t xml:space="preserve"> usando el mismo esquema de entrada, midiendo latencia, cumplimiento de formato, alucinaciones, validez de script y score compuesto. No obstante, el </w:t>
-      </w:r>
-      <w:proofErr w:type="spellStart"/>
-      <w:r>
-        <w:t>benchmark</w:t>
-      </w:r>
-      <w:proofErr w:type="spellEnd"/>
-      <w:r>
-        <w:t xml:space="preserve"> debe presentarse como evidencia valida solo cuando existan corridas exportadas desde AURA. Los fallos por credenciales o modelos no disponibles se registran como intentos fallidos, no como resultados experimentales concluyentes.</w:t>
+        <w:rPr>
+          <w:b w:val="0"/>
+          <w:i w:val="0"/>
+        </w:rPr>
+        <w:t>Evaluación del benchmark LLM</w:t>
+      </w:r>
+    </w:p>
+    <w:p>
+      <w:pPr/>
+      <w:r>
+        <w:rPr>
+          <w:b w:val="0"/>
+          <w:i w:val="0"/>
+        </w:rPr>
+        <w:t>El benchmark LLM queda definido como módulo experimental separado. Su función es comparar modelos locales y cloud bajo el mismo paquete estructurado de entrada, midiendo latencia, cumplimiento de formato, alucinaciones, validez de scripts y utilidad para la mejora del dataset. En esta segunda entrega se documenta la integración conceptual y de interfaz; las corridas formales deben anexarse como resultados preliminares cuando se consoliden ejecuciones comparables.</w:t>
       </w:r>
     </w:p>
     <w:p>

</xml_diff>

<commit_message>
Actualiza evidencia visual de segunda entrega
</commit_message>
<xml_diff>
--- a/docs/memoria/entregas/segunda_entrega/Segunda_Entrega_TFM_Joseph_Gari_Borrador_Estructurado.docx
+++ b/docs/memoria/entregas/segunda_entrega/Segunda_Entrega_TFM_Joseph_Gari_Borrador_Estructurado.docx
@@ -3,74 +3,6 @@
 <w:document xmlns:wpc="http://schemas.microsoft.com/office/word/2010/wordprocessingCanvas" xmlns:cx="http://schemas.microsoft.com/office/drawing/2014/chartex" xmlns:cx1="http://schemas.microsoft.com/office/drawing/2015/9/8/chartex" xmlns:cx2="http://schemas.microsoft.com/office/drawing/2015/10/21/chartex" xmlns:cx3="http://schemas.microsoft.com/office/drawing/2016/5/9/chartex" xmlns:cx4="http://schemas.microsoft.com/office/drawing/2016/5/10/chartex" xmlns:cx5="http://schemas.microsoft.com/office/drawing/2016/5/11/chartex" xmlns:cx6="http://schemas.microsoft.com/office/drawing/2016/5/12/chartex" xmlns:cx7="http://schemas.microsoft.com/office/drawing/2016/5/13/chartex" xmlns:cx8="http://schemas.microsoft.com/office/drawing/2016/5/14/chartex" xmlns:mc="http://schemas.openxmlformats.org/markup-compatibility/2006" xmlns:aink="http://schemas.microsoft.com/office/drawing/2016/ink" xmlns:am3d="http://schemas.microsoft.com/office/drawing/2017/model3d" xmlns:o="urn:schemas-microsoft-com:office:office" xmlns:oel="http://schemas.microsoft.com/office/2019/extlst" xmlns:r="http://schemas.openxmlformats.org/officeDocument/2006/relationships" xmlns:m="http://schemas.openxmlformats.org/officeDocument/2006/math" xmlns:v="urn:schemas-microsoft-com:vml" xmlns:wp14="http://schemas.microsoft.com/office/word/2010/wordprocessingDrawing" xmlns:wp="http://schemas.openxmlformats.org/drawingml/2006/wordprocessingDrawing" xmlns:w10="urn:schemas-microsoft-com:office:word" xmlns:w="http://schemas.openxmlformats.org/wordprocessingml/2006/main" xmlns:w14="http://schemas.microsoft.com/office/word/2010/wordml" xmlns:w15="http://schemas.microsoft.com/office/word/2012/wordml" xmlns:w16cex="http://schemas.microsoft.com/office/word/2018/wordml/cex" xmlns:w16cid="http://schemas.microsoft.com/office/word/2016/wordml/cid" xmlns:w16="http://schemas.microsoft.com/office/word/2018/wordml" xmlns:w16du="http://schemas.microsoft.com/office/word/2023/wordml/word16du" xmlns:w16sdtdh="http://schemas.microsoft.com/office/word/2020/wordml/sdtdatahash" xmlns:w16sdtfl="http://schemas.microsoft.com/office/word/2024/wordml/sdtformatlock" xmlns:w16se="http://schemas.microsoft.com/office/word/2015/wordml/symex" xmlns:wpg="http://schemas.microsoft.com/office/word/2010/wordprocessingGroup" xmlns:wpi="http://schemas.microsoft.com/office/word/2010/wordprocessingInk" xmlns:wne="http://schemas.microsoft.com/office/word/2006/wordml" xmlns:wps="http://schemas.microsoft.com/office/word/2010/wordprocessingShape" mc:Ignorable="w14 w15 w16se w16cid w16 w16cex w16sdtdh w16sdtfl w16du wp14">
   <w:body>
     <w:p/>
-    <w:p>
-      <w:pPr>
-        <w:pStyle w:val="NoSpacing"/>
-        <w:spacing w:line="276" w:lineRule="auto"/>
-        <w:jc w:val="center"/>
-        <w:rPr>
-          <w:rFonts w:asciiTheme="majorHAnsi" w:hAnsiTheme="majorHAnsi" w:cs="Open Sans"/>
-          <w:sz w:val="48"/>
-          <w:szCs w:val="28"/>
-        </w:rPr>
-      </w:pPr>
-      <w:r>
-        <w:rPr>
-          <w:rFonts w:asciiTheme="majorHAnsi" w:hAnsiTheme="majorHAnsi" w:cs="Open Sans"/>
-          <w:noProof/>
-          <w:sz w:val="48"/>
-          <w:szCs w:val="28"/>
-          <w:lang w:eastAsia="es-ES"/>
-        </w:rPr>
-        <w:drawing>
-          <wp:inline distT="0" distB="0" distL="0" distR="0" wp14:anchorId="19CEFD27" wp14:editId="34D292FE">
-            <wp:extent cx="3843319" cy="865249"/>
-            <wp:effectExtent l="0" t="0" r="0" b="0"/>
-            <wp:docPr id="5126" name="Imagen 5126" descr="Texto  Descripción generada automáticamente"/>
-            <wp:cNvGraphicFramePr>
-              <a:graphicFrameLocks xmlns:a="http://schemas.openxmlformats.org/drawingml/2006/main" noChangeAspect="1"/>
-            </wp:cNvGraphicFramePr>
-            <a:graphic xmlns:a="http://schemas.openxmlformats.org/drawingml/2006/main">
-              <a:graphicData uri="http://schemas.openxmlformats.org/drawingml/2006/picture">
-                <pic:pic xmlns:pic="http://schemas.openxmlformats.org/drawingml/2006/picture">
-                  <pic:nvPicPr>
-                    <pic:cNvPr id="5126" name="Imagen 5126" descr="Texto  Descripción generada automáticamente"/>
-                    <pic:cNvPicPr>
-                      <a:picLocks noChangeAspect="1"/>
-                    </pic:cNvPicPr>
-                  </pic:nvPicPr>
-                  <pic:blipFill>
-                    <a:blip r:embed="rId11">
-                      <a:extLst>
-                        <a:ext uri="{28A0092B-C50C-407E-A947-70E740481C1C}">
-                          <a14:useLocalDpi xmlns:a14="http://schemas.microsoft.com/office/drawing/2010/main" val="0"/>
-                        </a:ext>
-                      </a:extLst>
-                    </a:blip>
-                    <a:stretch>
-                      <a:fillRect/>
-                    </a:stretch>
-                  </pic:blipFill>
-                  <pic:spPr bwMode="auto">
-                    <a:xfrm>
-                      <a:off x="0" y="0"/>
-                      <a:ext cx="3843319" cy="865249"/>
-                    </a:xfrm>
-                    <a:prstGeom prst="rect">
-                      <a:avLst/>
-                    </a:prstGeom>
-                    <a:noFill/>
-                    <a:ln>
-                      <a:noFill/>
-                    </a:ln>
-                  </pic:spPr>
-                </pic:pic>
-              </a:graphicData>
-            </a:graphic>
-          </wp:inline>
-        </w:drawing>
-      </w:r>
-    </w:p>
     <w:p>
       <w:pPr>
         <w:pStyle w:val="NoSpacing"/>
@@ -5793,43 +5725,6 @@
     <w:p>
       <w:pPr/>
       <w:r>
-        <w:drawing>
-          <wp:inline xmlns:a="http://schemas.openxmlformats.org/drawingml/2006/main" xmlns:pic="http://schemas.openxmlformats.org/drawingml/2006/picture">
-            <wp:extent cx="5852160" cy="3840480"/>
-            <wp:docPr id="5127" name="Picture 5127"/>
-            <wp:cNvGraphicFramePr>
-              <a:graphicFrameLocks noChangeAspect="1"/>
-            </wp:cNvGraphicFramePr>
-            <a:graphic>
-              <a:graphicData uri="http://schemas.openxmlformats.org/drawingml/2006/picture">
-                <pic:pic>
-                  <pic:nvPicPr>
-                    <pic:cNvPr id="0" name="aura-arquitectura-flujo.png"/>
-                    <pic:cNvPicPr/>
-                  </pic:nvPicPr>
-                  <pic:blipFill>
-                    <a:blip r:embed="rId16"/>
-                    <a:stretch>
-                      <a:fillRect/>
-                    </a:stretch>
-                  </pic:blipFill>
-                  <pic:spPr>
-                    <a:xfrm>
-                      <a:off x="0" y="0"/>
-                      <a:ext cx="5852160" cy="3840480"/>
-                    </a:xfrm>
-                    <a:prstGeom prst="rect"/>
-                  </pic:spPr>
-                </pic:pic>
-              </a:graphicData>
-            </a:graphic>
-          </wp:inline>
-        </w:drawing>
-      </w:r>
-    </w:p>
-    <w:p>
-      <w:pPr/>
-      <w:r>
         <w:rPr>
           <w:b w:val="0"/>
           <w:i/>
@@ -6236,10 +6131,15 @@
     <w:p>
       <w:pPr/>
       <w:r>
+        <w:t>Figura 5.2. Perfilamiento actualizado del dataset clientes_sucio.csv: caracterización, score y hallazgos reproducibles bajo la interfaz Casabero.</w:t>
+      </w:r>
+    </w:p>
+    <w:p>
+      <w:r>
         <w:drawing>
           <wp:inline xmlns:a="http://schemas.openxmlformats.org/drawingml/2006/main" xmlns:pic="http://schemas.openxmlformats.org/drawingml/2006/picture">
-            <wp:extent cx="5852160" cy="3706368"/>
-            <wp:docPr id="5128" name="Picture 5128"/>
+            <wp:extent cx="5852160" cy="3982720"/>
+            <wp:docPr id="1" name="Picture 1"/>
             <wp:cNvGraphicFramePr>
               <a:graphicFrameLocks noChangeAspect="1"/>
             </wp:cNvGraphicFramePr>
@@ -6251,7 +6151,7 @@
                     <pic:cNvPicPr/>
                   </pic:nvPicPr>
                   <pic:blipFill>
-                    <a:blip r:embed="rId17"/>
+                    <a:blip r:embed="rId23"/>
                     <a:stretch>
                       <a:fillRect/>
                     </a:stretch>
@@ -6259,7 +6159,7 @@
                   <pic:spPr>
                     <a:xfrm>
                       <a:off x="0" y="0"/>
-                      <a:ext cx="5852160" cy="3706368"/>
+                      <a:ext cx="5852160" cy="3982720"/>
                     </a:xfrm>
                     <a:prstGeom prst="rect"/>
                   </pic:spPr>
@@ -6273,20 +6173,15 @@
     <w:p>
       <w:pPr/>
       <w:r>
-        <w:rPr>
-          <w:b w:val="0"/>
-          <w:i/>
-        </w:rPr>
-        <w:t>Figura 5.2. Perfilamiento del dataset clientes_sucio.csv: caracterización, reglas activadas y salida estructurada.</w:t>
-      </w:r>
-    </w:p>
-    <w:p>
-      <w:pPr/>
+        <w:t>Figura 5.3. Perfilamiento actualizado del dataset inventario_sucio.csv con hallazgos de integridad, tipos y consistencia.</w:t>
+      </w:r>
+    </w:p>
+    <w:p>
       <w:r>
         <w:drawing>
           <wp:inline xmlns:a="http://schemas.openxmlformats.org/drawingml/2006/main" xmlns:pic="http://schemas.openxmlformats.org/drawingml/2006/picture">
-            <wp:extent cx="5852160" cy="3706368"/>
-            <wp:docPr id="5129" name="Picture 5129"/>
+            <wp:extent cx="5852160" cy="3982720"/>
+            <wp:docPr id="2" name="Picture 2"/>
             <wp:cNvGraphicFramePr>
               <a:graphicFrameLocks noChangeAspect="1"/>
             </wp:cNvGraphicFramePr>
@@ -6298,7 +6193,7 @@
                     <pic:cNvPicPr/>
                   </pic:nvPicPr>
                   <pic:blipFill>
-                    <a:blip r:embed="rId18"/>
+                    <a:blip r:embed="rId24"/>
                     <a:stretch>
                       <a:fillRect/>
                     </a:stretch>
@@ -6306,7 +6201,7 @@
                   <pic:spPr>
                     <a:xfrm>
                       <a:off x="0" y="0"/>
-                      <a:ext cx="5852160" cy="3706368"/>
+                      <a:ext cx="5852160" cy="3982720"/>
                     </a:xfrm>
                     <a:prstGeom prst="rect"/>
                   </pic:spPr>
@@ -6320,20 +6215,15 @@
     <w:p>
       <w:pPr/>
       <w:r>
-        <w:rPr>
-          <w:b w:val="0"/>
-          <w:i/>
-        </w:rPr>
-        <w:t>Figura 5.3. Perfilamiento del dataset inventario_sucio.csv con hallazgos de integridad, tipos y placeholders.</w:t>
-      </w:r>
-    </w:p>
-    <w:p>
-      <w:pPr/>
+        <w:t>Figura 5.4. Perfilamiento actualizado del dataset operaciones_sucio.csv con duplicados, nulos y reglas operacionales.</w:t>
+      </w:r>
+    </w:p>
+    <w:p>
       <w:r>
         <w:drawing>
           <wp:inline xmlns:a="http://schemas.openxmlformats.org/drawingml/2006/main" xmlns:pic="http://schemas.openxmlformats.org/drawingml/2006/picture">
-            <wp:extent cx="5852160" cy="3706368"/>
-            <wp:docPr id="5130" name="Picture 5130"/>
+            <wp:extent cx="5852160" cy="3982720"/>
+            <wp:docPr id="3" name="Picture 3"/>
             <wp:cNvGraphicFramePr>
               <a:graphicFrameLocks noChangeAspect="1"/>
             </wp:cNvGraphicFramePr>
@@ -6345,7 +6235,7 @@
                     <pic:cNvPicPr/>
                   </pic:nvPicPr>
                   <pic:blipFill>
-                    <a:blip r:embed="rId19"/>
+                    <a:blip r:embed="rId25"/>
                     <a:stretch>
                       <a:fillRect/>
                     </a:stretch>
@@ -6353,7 +6243,7 @@
                   <pic:spPr>
                     <a:xfrm>
                       <a:off x="0" y="0"/>
-                      <a:ext cx="5852160" cy="3706368"/>
+                      <a:ext cx="5852160" cy="3982720"/>
                     </a:xfrm>
                     <a:prstGeom prst="rect"/>
                   </pic:spPr>
@@ -6367,20 +6257,15 @@
     <w:p>
       <w:pPr/>
       <w:r>
-        <w:rPr>
-          <w:b w:val="0"/>
-          <w:i/>
-        </w:rPr>
-        <w:t>Figura 5.4. Perfilamiento del dataset operaciones_sucio.csv con problemas temporales, duplicados y formatos inválidos.</w:t>
-      </w:r>
-    </w:p>
-    <w:p>
-      <w:pPr/>
+        <w:t>Figura 5.5. Etapa de diagnóstico asistido: contrato de entrada, problema observado y paquete controlado para el LLM.</w:t>
+      </w:r>
+    </w:p>
+    <w:p>
       <w:r>
         <w:drawing>
           <wp:inline xmlns:a="http://schemas.openxmlformats.org/drawingml/2006/main" xmlns:pic="http://schemas.openxmlformats.org/drawingml/2006/picture">
-            <wp:extent cx="5852160" cy="3706368"/>
-            <wp:docPr id="5131" name="Picture 5131"/>
+            <wp:extent cx="5852160" cy="3982720"/>
+            <wp:docPr id="4" name="Picture 4"/>
             <wp:cNvGraphicFramePr>
               <a:graphicFrameLocks noChangeAspect="1"/>
             </wp:cNvGraphicFramePr>
@@ -6392,7 +6277,7 @@
                     <pic:cNvPicPr/>
                   </pic:nvPicPr>
                   <pic:blipFill>
-                    <a:blip r:embed="rId20"/>
+                    <a:blip r:embed="rId26"/>
                     <a:stretch>
                       <a:fillRect/>
                     </a:stretch>
@@ -6400,7 +6285,7 @@
                   <pic:spPr>
                     <a:xfrm>
                       <a:off x="0" y="0"/>
-                      <a:ext cx="5852160" cy="3706368"/>
+                      <a:ext cx="5852160" cy="3982720"/>
                     </a:xfrm>
                     <a:prstGeom prst="rect"/>
                   </pic:spPr>
@@ -6414,20 +6299,15 @@
     <w:p>
       <w:pPr/>
       <w:r>
-        <w:rPr>
-          <w:b w:val="0"/>
-          <w:i/>
-        </w:rPr>
-        <w:t>Figura 5.5. Etapa de diagnóstico asistido: contrato de entrada, problema observado y modo de ejecución.</w:t>
-      </w:r>
-    </w:p>
-    <w:p>
-      <w:pPr/>
+        <w:t>Figura 5.6. Laboratorio experimental de modelos: protocolo, dataset, contrato AURA, runner y matriz de benchmark.</w:t>
+      </w:r>
+    </w:p>
+    <w:p>
       <w:r>
         <w:drawing>
           <wp:inline xmlns:a="http://schemas.openxmlformats.org/drawingml/2006/main" xmlns:pic="http://schemas.openxmlformats.org/drawingml/2006/picture">
-            <wp:extent cx="5852160" cy="3706368"/>
-            <wp:docPr id="5132" name="Picture 5132"/>
+            <wp:extent cx="5852160" cy="3982720"/>
+            <wp:docPr id="5" name="Picture 5"/>
             <wp:cNvGraphicFramePr>
               <a:graphicFrameLocks noChangeAspect="1"/>
             </wp:cNvGraphicFramePr>
@@ -6439,7 +6319,7 @@
                     <pic:cNvPicPr/>
                   </pic:nvPicPr>
                   <pic:blipFill>
-                    <a:blip r:embed="rId21"/>
+                    <a:blip r:embed="rId27"/>
                     <a:stretch>
                       <a:fillRect/>
                     </a:stretch>
@@ -6447,7 +6327,7 @@
                   <pic:spPr>
                     <a:xfrm>
                       <a:off x="0" y="0"/>
-                      <a:ext cx="5852160" cy="3706368"/>
+                      <a:ext cx="5852160" cy="3982720"/>
                     </a:xfrm>
                     <a:prstGeom prst="rect"/>
                   </pic:spPr>
@@ -6461,20 +6341,15 @@
     <w:p>
       <w:pPr/>
       <w:r>
-        <w:rPr>
-          <w:b w:val="0"/>
-          <w:i/>
-        </w:rPr>
-        <w:t>Figura 5.6. Generación de script de asistencia con respaldo determinista y matriz de validación automática.</w:t>
-      </w:r>
-    </w:p>
-    <w:p>
-      <w:pPr/>
+        <w:t>Figura 5.7. Drawer de configuración: selección de proveedor local/cloud y edición guiada del contrato técnico.</w:t>
+      </w:r>
+    </w:p>
+    <w:p>
       <w:r>
         <w:drawing>
           <wp:inline xmlns:a="http://schemas.openxmlformats.org/drawingml/2006/main" xmlns:pic="http://schemas.openxmlformats.org/drawingml/2006/picture">
-            <wp:extent cx="5852160" cy="3706368"/>
-            <wp:docPr id="5133" name="Picture 5133"/>
+            <wp:extent cx="5852160" cy="3982720"/>
+            <wp:docPr id="6" name="Picture 6"/>
             <wp:cNvGraphicFramePr>
               <a:graphicFrameLocks noChangeAspect="1"/>
             </wp:cNvGraphicFramePr>
@@ -6486,7 +6361,7 @@
                     <pic:cNvPicPr/>
                   </pic:nvPicPr>
                   <pic:blipFill>
-                    <a:blip r:embed="rId22"/>
+                    <a:blip r:embed="rId28"/>
                     <a:stretch>
                       <a:fillRect/>
                     </a:stretch>
@@ -6494,7 +6369,7 @@
                   <pic:spPr>
                     <a:xfrm>
                       <a:off x="0" y="0"/>
-                      <a:ext cx="5852160" cy="3706368"/>
+                      <a:ext cx="5852160" cy="3982720"/>
                     </a:xfrm>
                     <a:prstGeom prst="rect"/>
                   </pic:spPr>
@@ -6506,16 +6381,6 @@
       </w:r>
     </w:p>
     <w:p>
-      <w:pPr/>
-      <w:r>
-        <w:rPr>
-          <w:b w:val="0"/>
-          <w:i/>
-        </w:rPr>
-        <w:t>Figura 5.7. Revisión humana del script, decisión de aprobación y preparación para simulación.</w:t>
-      </w:r>
-    </w:p>
-    <w:p>
       <w:pPr>
         <w:pStyle w:val="Heading2"/>
       </w:pPr>
@@ -6530,55 +6395,47 @@
     <w:p>
       <w:pPr/>
       <w:r>
+        <w:t>La evaluación preliminar se centra en tres dimensiones: aplicabilidad técnica, usabilidad del flujo y alineación visual-documental tras la migración de interfaz. La aplicabilidad técnica se observa en la capacidad del motor para activar hallazgos reproducibles sobre datasets controlados y en la capacidad del sistema para transformar esos hallazgos en una entrada estructurada para diagnóstico y script. La usabilidad se evalúa mediante la claridad de las etapas y la separación entre perfilamiento, interpretación, script, revisión y exportación.</w:t>
+      </w:r>
+    </w:p>
+    <w:p>
+      <w:pPr>
+        <w:pStyle w:val="Heading3"/>
+      </w:pPr>
+      <w:r>
         <w:rPr>
           <w:b w:val="0"/>
           <w:i w:val="0"/>
         </w:rPr>
-        <w:t>La evaluación preliminar se centra en dos dimensiones: aplicabilidad técnica y usabilidad del flujo. La aplicabilidad técnica se observa en la capacidad del motor para activar hallazgos reproducibles sobre datasets controlados y en la capacidad del sistema para transformar esos hallazgos en una entrada estructurada para diagnóstico y script. La usabilidad se evalúa mediante la claridad de las etapas y la separación entre perfilamiento, interpretación, script, revisión y exportación.</w:t>
-      </w:r>
-    </w:p>
-    <w:p>
-      <w:pPr>
-        <w:pStyle w:val="Heading3"/>
-      </w:pPr>
+        <w:t>Evaluación de aplicabilidad técnica</w:t>
+      </w:r>
+    </w:p>
+    <w:p>
+      <w:pPr/>
       <w:r>
         <w:rPr>
           <w:b w:val="0"/>
           <w:i w:val="0"/>
         </w:rPr>
-        <w:t>Evaluación de aplicabilidad técnica</w:t>
-      </w:r>
-    </w:p>
-    <w:p>
-      <w:pPr/>
+        <w:t>Las pruebas con los tres datasets muestran que el motor detecta anomalías estructurales en archivos de baja complejidad, generando hallazgos con recuento, porcentaje y columna asociada. Además, la generación de script ya no depende exclusivamente de una respuesta perfecta del proveedor LLM: si la salida no contiene un campo python_script válido, AURA construye un script Pandas base a partir de acciones deterministas y lo somete igualmente a validación automática.</w:t>
+      </w:r>
+    </w:p>
+    <w:p>
+      <w:pPr>
+        <w:pStyle w:val="Heading3"/>
+      </w:pPr>
       <w:r>
         <w:rPr>
           <w:b w:val="0"/>
           <w:i w:val="0"/>
         </w:rPr>
-        <w:t>Las pruebas con los tres datasets muestran que el motor detecta anomalías estructurales en archivos de baja complejidad, generando hallazgos con recuento, porcentaje y columna asociada. Además, la generación de script ya no depende exclusivamente de una respuesta perfecta del proveedor LLM: si la salida no contiene un campo python_script válido, AURA construye un script Pandas base a partir de acciones deterministas y lo somete igualmente a validación automática.</w:t>
-      </w:r>
-    </w:p>
-    <w:p>
-      <w:pPr>
-        <w:pStyle w:val="Heading3"/>
-      </w:pPr>
-      <w:r>
-        <w:rPr>
-          <w:b w:val="0"/>
-          <w:i w:val="0"/>
-        </w:rPr>
         <w:t>Evaluación de usabilidad</w:t>
       </w:r>
     </w:p>
     <w:p>
       <w:pPr/>
       <w:r>
-        <w:rPr>
-          <w:b w:val="0"/>
-          <w:i w:val="0"/>
-        </w:rPr>
-        <w:t>El flujo revisado reduce ruido visual y evita que el usuario tenga que interpretar nombres internos de capas o prompts extensos. En Perfilar se muestra caracterización y reglas; en Diagnóstico se muestra el contrato de entrada y el problema observado; en Script se muestra origen, validación y respaldo; y en Revisión se presenta una decisión HITL antes de la simulación. Esta separación favorece una interfaz natural y defendible para el TFM.</w:t>
+        <w:t>El flujo revisado reduce ruido visual, agrupa la información por responsabilidad y evita que el usuario tenga que interpretar nombres internos de capas o prompts extensos. En Perfilar se muestra caracterización y reglas; en Diagnóstico se muestra el contrato de entrada y el problema observado; en Script se muestra origen, validación y respaldo; y en Revisión se presenta una decisión HITL antes de la simulación. Esta separación favorece una interfaz natural y defendible para el TFM.</w:t>
       </w:r>
     </w:p>
     <w:p>

</xml_diff>